<commit_message>
docs: refresh suite for 31-check demo, live College Scorecard COA + authoritative 2026-27 Pell, step-two workflows (verify_documents/professional judgment); fold no-space-path, cmd.exe detached-launch, and stop-orphaned-sign-off-executions lessons into the SA runbook + maintenance
</commit_message>
<xml_diff>
--- a/docs/Financial-Aid-AgentCore-Maintenance.docx
+++ b/docs/Financial-Aid-AgentCore-Maintenance.docx
@@ -694,7 +694,7 @@
           <w:sz w:val="17"/>
           <w:szCs w:val="17"/>
         </w:rPr>
-        <w:t xml:space="preserve">bash lib/engine/demo.sh    agents/financial-aid   # smoke test: expect 21/21</w:t>
+        <w:t xml:space="preserve">bash lib/engine/demo.sh    agents/financial-aid   # smoke test: expect 31/31</w:t>
       </w:r>
     </w:p>
     <w:p>
@@ -1519,7 +1519,7 @@
         <w:t xml:space="preserve">bash lib/engine/demo.sh agents/financial-aid</w:t>
       </w:r>
       <w:r>
-        <w:t xml:space="preserve"> is the fastest health check — 21/21 means the whole governed path is intact.</w:t>
+        <w:t xml:space="preserve"> is the fastest health check — 31/31 means the whole governed path is intact.</w:t>
       </w:r>
     </w:p>
     <w:p>
@@ -1866,6 +1866,38 @@
       </w:r>
       <w:r>
         <w:t xml:space="preserve"> (runtime + ECR + CodeBuild), and delete the Cognito pool.</w:t>
+      </w:r>
+    </w:p>
+    <w:p>
+      <w:pPr>
+        <w:pStyle w:val="ListParagraph"/>
+        <w:numPr>
+          <w:ilvl w:val="0"/>
+          <w:numId w:val="1"/>
+        </w:numPr>
+        <w:spacing w:after="70" w:line="260"/>
+      </w:pPr>
+      <w:r>
+        <w:rPr>
+          <w:b/>
+          <w:bCs/>
+        </w:rPr>
+        <w:t xml:space="preserve">Stop pending sign-off executions first. </w:t>
+      </w:r>
+      <w:r>
+        <w:t xml:space="preserve">If you invoked the agent and left a determination PENDING (never approved), stop that RUNNING Step Functions execution before teardown — otherwise it keeps </w:t>
+      </w:r>
+      <w:r>
+        <w:rPr>
+          <w:rFonts w:ascii="Consolas" w:cs="Consolas" w:eastAsia="Consolas" w:hAnsi="Consolas"/>
+          <w:color w:val="1B3A2B"/>
+          <w:sz w:val="18"/>
+          <w:szCs w:val="18"/>
+        </w:rPr>
+        <w:t xml:space="preserve">fa-signoff</w:t>
+      </w:r>
+      <w:r>
+        <w:t xml:space="preserve"> stuck DELETING and blocks the next deploy (see §7).</w:t>
       </w:r>
     </w:p>
     <w:p>
@@ -2097,6 +2129,106 @@
                 <w:szCs w:val="19"/>
               </w:rPr>
               <w:t xml:space="preserve">Non-login shells may lack the PATH. Use a login shell (bash -l) and confirm pip show pyyaml.</w:t>
+            </w:r>
+          </w:p>
+        </w:tc>
+      </w:tr>
+      <w:tr>
+        <w:tc>
+          <w:tcPr>
+            <w:tcW w:type="dxa" w:w="3100"/>
+            <w:shd w:fill="F4F8FA" w:val="clear"/>
+            <w:tcMar>
+              <w:top w:type="dxa" w:w="60"/>
+              <w:left w:type="dxa" w:w="110"/>
+              <w:bottom w:type="dxa" w:w="60"/>
+              <w:right w:type="dxa" w:w="110"/>
+            </w:tcMar>
+          </w:tcPr>
+          <w:p>
+            <w:pPr>
+              <w:spacing w:after="0" w:line="250"/>
+            </w:pPr>
+            <w:r>
+              <w:rPr>
+                <w:sz w:val="19"/>
+                <w:szCs w:val="19"/>
+              </w:rPr>
+              <w:t xml:space="preserve">Deploy fails: StateMachineDeleting on fa-signoff</w:t>
+            </w:r>
+          </w:p>
+        </w:tc>
+        <w:tc>
+          <w:tcPr>
+            <w:tcW w:type="dxa" w:w="7340"/>
+            <w:shd w:fill="F4F8FA" w:val="clear"/>
+            <w:tcMar>
+              <w:top w:type="dxa" w:w="60"/>
+              <w:left w:type="dxa" w:w="110"/>
+              <w:bottom w:type="dxa" w:w="60"/>
+              <w:right w:type="dxa" w:w="110"/>
+            </w:tcMar>
+          </w:tcPr>
+          <w:p>
+            <w:pPr>
+              <w:spacing w:after="0" w:line="250"/>
+            </w:pPr>
+            <w:r>
+              <w:rPr>
+                <w:sz w:val="19"/>
+                <w:szCs w:val="19"/>
+              </w:rPr>
+              <w:t xml:space="preserve">A prior invoke left a waitForTaskToken sign-off execution RUNNING (a PENDING determination that was never approved). It keeps the fa-signoff state machine stuck DELETING, which blocks re-creating one of the same name. Stop the leftover execution (list-executions --status-filter RUNNING → stop-execution), let deletion finish, then redeploy. Stop pending sign-off executions BEFORE teardown to avoid this.</w:t>
+            </w:r>
+          </w:p>
+        </w:tc>
+      </w:tr>
+      <w:tr>
+        <w:tc>
+          <w:tcPr>
+            <w:tcW w:type="dxa" w:w="3100"/>
+            <w:shd w:fill="FFFFFF" w:val="clear"/>
+            <w:tcMar>
+              <w:top w:type="dxa" w:w="60"/>
+              <w:left w:type="dxa" w:w="110"/>
+              <w:bottom w:type="dxa" w:w="60"/>
+              <w:right w:type="dxa" w:w="110"/>
+            </w:tcMar>
+          </w:tcPr>
+          <w:p>
+            <w:pPr>
+              <w:spacing w:after="0" w:line="250"/>
+            </w:pPr>
+            <w:r>
+              <w:rPr>
+                <w:sz w:val="19"/>
+                <w:szCs w:val="19"/>
+              </w:rPr>
+              <w:t xml:space="preserve">lookup_coa returns found=false / rate-limited</w:t>
+            </w:r>
+          </w:p>
+        </w:tc>
+        <w:tc>
+          <w:tcPr>
+            <w:tcW w:type="dxa" w:w="7340"/>
+            <w:shd w:fill="FFFFFF" w:val="clear"/>
+            <w:tcMar>
+              <w:top w:type="dxa" w:w="60"/>
+              <w:left w:type="dxa" w:w="110"/>
+              <w:bottom w:type="dxa" w:w="60"/>
+              <w:right w:type="dxa" w:w="110"/>
+            </w:tcMar>
+          </w:tcPr>
+          <w:p>
+            <w:pPr>
+              <w:spacing w:after="0" w:line="250"/>
+            </w:pPr>
+            <w:r>
+              <w:rPr>
+                <w:sz w:val="19"/>
+                <w:szCs w:val="19"/>
+              </w:rPr>
+              <w:t xml:space="preserve">College Scorecard call failed. The tool uses the shared DEMO_KEY by default (low rate limit); set SCORECARD_API_KEY to a free api.data.gov key for a pilot. The tool fails soft (falls back to tuition, then returns found=false) so the workflow can degrade gracefully.</w:t>
             </w:r>
           </w:p>
         </w:tc>

</xml_diff>

<commit_message>
fix(sign-off) + docs: request_signoff takes validated access_token (P0-5 parity); correct live count to 32/32
EDU manifest still required 'requester'; live ENFORCE demo failed until fixed, now passes 32/32.
Updated decks/guides/README to the verified 32/32 and regenerated the .pptx/.docx.
</commit_message>
<xml_diff>
--- a/docs/Financial-Aid-AgentCore-Maintenance.docx
+++ b/docs/Financial-Aid-AgentCore-Maintenance.docx
@@ -694,7 +694,7 @@
           <w:sz w:val="17"/>
           <w:szCs w:val="17"/>
         </w:rPr>
-        <w:t xml:space="preserve">bash lib/engine/demo.sh    agents/financial-aid   # smoke test: expect 31/31</w:t>
+        <w:t xml:space="preserve">bash lib/engine/demo.sh    agents/financial-aid   # smoke test: expect 32/32</w:t>
       </w:r>
     </w:p>
     <w:p>
@@ -1519,7 +1519,7 @@
         <w:t xml:space="preserve">bash lib/engine/demo.sh agents/financial-aid</w:t>
       </w:r>
       <w:r>
-        <w:t xml:space="preserve"> is the fastest health check — 31/31 means the whole governed path is intact.</w:t>
+        <w:t xml:space="preserve"> is the fastest health check — 32/32 means the whole governed path is intact.</w:t>
       </w:r>
     </w:p>
     <w:p>

</xml_diff>

<commit_message>
Regenerate SA Runbook + Maintenance docx to the supported CDK path (were stale)
The SA Runbook and Maintenance guides still described only the legacy shell engine + the 32-check demo. Runbook: new Section 0 THE SUPPORTED PATH (CDK deploy at v0.1.0-pilot-rc1, run-a-case pass-by-reference flow incl. VerificationHold, operations/independent-verification/teardown incl. the retained-CMK-by-tag + Hyperplane-ENI notes) + legacy-callout on the shell sections. Maintenance: supported-path banner (CDK deploy/destroy at the tag; shell commands marked legacy). Both regenerated from generators. Now all GTM + ops docs are current with EP1. Suite 137/137.
</commit_message>
<xml_diff>
--- a/docs/Financial-Aid-AgentCore-Maintenance.docx
+++ b/docs/Financial-Aid-AgentCore-Maintenance.docx
@@ -57,7 +57,7 @@
           <w:sz w:val="19"/>
           <w:szCs w:val="19"/>
         </w:rPr>
-        <w:t xml:space="preserve">Day-two operations for the governed Title IV financial-aid accelerator — routine changes, the Runtime lifecycle, monitoring, audit-evidence handling, teardown/rebuild, and the known toolchain gotchas. Accelerator reference. Version 1.0 · 2026.</w:t>
+        <w:t xml:space="preserve">Day-two operations for the governed Financial Aid Verification &amp; Student Communication Assistant. THE SUPPORTED DEPLOYMENT IS AWS CDK at the validated release tag v0.1.0-pilot-rc1 (EP1 live-validated). This guide's operational content applies to that deployment; the shell-engine commands in sections 2 and 6 are LEGACY internal reference only. Accelerator reference. Version 2.0 · 2026-07.</w:t>
       </w:r>
     </w:p>
     <w:p>
@@ -222,6 +222,59 @@
         <w:br w:type="page"/>
       </w:r>
     </w:p>
+    <w:tbl>
+      <w:tblPr>
+        <w:tblW w:type="pct" w:w="100%"/>
+        <w:tblBorders>
+          <w:top w:val="single" w:color="1C7293" w:sz="2"/>
+          <w:left w:val="single" w:color="1C7293" w:sz="18"/>
+          <w:bottom w:val="single" w:color="1C7293" w:sz="2"/>
+          <w:right w:val="single" w:color="1C7293" w:sz="2"/>
+          <w:insideH w:val="none"/>
+          <w:insideV w:val="none"/>
+        </w:tblBorders>
+      </w:tblPr>
+      <w:tblGrid>
+        <w:gridCol w:w="10440"/>
+      </w:tblGrid>
+      <w:tr>
+        <w:tc>
+          <w:tcPr>
+            <w:tcW w:type="dxa" w:w="10440"/>
+            <w:shd w:fill="EEF3F7" w:val="clear"/>
+            <w:tcMar>
+              <w:top w:type="dxa" w:w="120"/>
+              <w:left w:type="dxa" w:w="180"/>
+              <w:bottom w:type="dxa" w:w="120"/>
+              <w:right w:type="dxa" w:w="180"/>
+            </w:tcMar>
+          </w:tcPr>
+          <w:p>
+            <w:pPr>
+              <w:spacing w:after="40"/>
+            </w:pPr>
+            <w:r>
+              <w:rPr>
+                <w:b/>
+                <w:bCs/>
+                <w:color w:val="1C7293"/>
+                <w:sz w:val="20"/>
+                <w:szCs w:val="20"/>
+              </w:rPr>
+              <w:t xml:space="preserve">Supported path</w:t>
+            </w:r>
+          </w:p>
+          <w:p>
+            <w:pPr>
+              <w:spacing w:after="20" w:line="258"/>
+            </w:pPr>
+            <w:r>
+              <w:t xml:space="preserve">Deploy, upgrade, and tear down via AWS CDK at the validated release tag (git checkout v0.1.0-pilot-rc1; cdk deploy/destroy --all). The shell-engine (deploy.sh/demo.sh/destroy.sh) commands below are LEGACY internal reference. Upgrades: deploy a new tagged release (change-sets are reviewable), never patch in place; roll back by redeploying the prior tag. See DEPLOYMENT-GUIDE.md and docs/KEY-MANAGEMENT.md.</w:t>
+            </w:r>
+          </w:p>
+        </w:tc>
+      </w:tr>
+    </w:tbl>
     <w:p>
       <w:pPr>
         <w:pStyle w:val="Heading1"/>

</xml_diff>

<commit_message>
Maintenance doc: supported-path banner + legacy tags on shell sections; validate_deployment as the health check (regenerated). Fixes release-consistency gate. Suite 137/137
</commit_message>
<xml_diff>
--- a/docs/Financial-Aid-AgentCore-Maintenance.docx
+++ b/docs/Financial-Aid-AgentCore-Maintenance.docx
@@ -269,7 +269,7 @@
               <w:spacing w:after="20" w:line="258"/>
             </w:pPr>
             <w:r>
-              <w:t xml:space="preserve">Deploy, upgrade, and tear down via AWS CDK at the validated release tag (git checkout v0.1.0-pilot-rc1; cdk deploy/destroy --all). The shell-engine (deploy.sh/demo.sh/destroy.sh) commands below are LEGACY internal reference. Upgrades: deploy a new tagged release (change-sets are reviewable), never patch in place; roll back by redeploying the prior tag. See DEPLOYMENT-GUIDE.md and docs/KEY-MANAGEMENT.md.</w:t>
+              <w:t xml:space="preserve">Deploy, upgrade, and tear down via AWS CDK at the validated release tag (`git checkout v0.1.0-pilot-rc1` then `cdk deploy`/`destroy --all`). The shell-engine (deploy.sh/demo.sh/destroy.sh) commands below are LEGACY internal reference. Upgrades: deploy a new tagged release (change-sets are reviewable), never patch in place; roll back by redeploying the prior tag. See DEPLOYMENT-GUIDE.md and docs/KEY-MANAGEMENT.md.</w:t>
             </w:r>
           </w:p>
         </w:tc>
@@ -686,12 +686,12 @@
         <w:pStyle w:val="Heading2"/>
       </w:pPr>
       <w:r>
-        <w:t xml:space="preserve">2.1 Refresh the spine</w:t>
-      </w:r>
-    </w:p>
-    <w:p>
-      <w:r>
-        <w:t xml:space="preserve">The safest way to apply most spine changes is a clean rebuild. Destroy leaves identity intact; deploy reuses it.</w:t>
+        <w:t xml:space="preserve">2.1 Refresh the spine (SUPPORTED: cdk deploy at the tag; shell shown is LEGACY)</w:t>
+      </w:r>
+    </w:p>
+    <w:p>
+      <w:r>
+        <w:t xml:space="preserve">SUPPORTED PATH: redeploy a new validated release tag with cdk deploy --all (change-sets are reviewable). The shell rebuild below is LEGACY internal reference. Destroy leaves identity intact; deploy reuses it.</w:t>
       </w:r>
     </w:p>
     <w:p>
@@ -1560,7 +1560,19 @@
           <w:b/>
           <w:bCs/>
         </w:rPr>
-        <w:t xml:space="preserve">Spine smoke test: </w:t>
+        <w:t xml:space="preserve">Health check (SUPPORTED): </w:t>
+      </w:r>
+      <w:r>
+        <w:rPr>
+          <w:rFonts w:ascii="Consolas" w:cs="Consolas" w:eastAsia="Consolas" w:hAnsi="Consolas"/>
+          <w:color w:val="1B3A2B"/>
+          <w:sz w:val="18"/>
+          <w:szCs w:val="18"/>
+        </w:rPr>
+        <w:t xml:space="preserve">python scripts/validate_deployment.py --env &lt;env&gt;</w:t>
+      </w:r>
+      <w:r>
+        <w:t xml:space="preserve"> emits the machine PASS/FAIL verdict (masking, forged-ref denial, ingest pass-by-reference, workflow fail-closed). The legacy shell smoke test was </w:t>
       </w:r>
       <w:r>
         <w:rPr>
@@ -1572,7 +1584,7 @@
         <w:t xml:space="preserve">bash lib/engine/demo.sh agents/financial-aid</w:t>
       </w:r>
       <w:r>
-        <w:t xml:space="preserve"> is the fastest health check — 32/32 means the whole governed path is intact.</w:t>
+        <w:t xml:space="preserve">.</w:t>
       </w:r>
     </w:p>
     <w:p>

</xml_diff>

<commit_message>
Cut v0.1.1-pilot-rc1: pin reconciled state; fix residual COA overclaim in README workflow
- RELEASE + anchor docs (README banner/checkout, START-HERE, DEPLOYMENT-GUIDE, cdk/README) + the
  release-validation workflow default + runbook/maintenance generators bumped v0.1.0 -> v0.1.1-pilot-rc1
- VALIDATED_RELEASE + RELEASE-MANIFEST: v0.1.1 is the supported tag; EP1 validated the identical-infra
  v0.1.0 code (v0.1.1 = docs+tests only, no infra change) — evidence carries forward
- README workflow section: lookup_coa 'real Cost of Attendance (authoritative, live)' -> institution-level
  REFERENCE COA (never institutional COA); assess_aid drives the Pell ESTIMATE; 'must make and commit the
  award' -> 'make and record the award decision in the authoritative system'
- regenerated SA-Runbook + Maintenance docx at v0.1.1

Suite 150/150; release-consistency gate green.
</commit_message>
<xml_diff>
--- a/docs/Financial-Aid-AgentCore-Maintenance.docx
+++ b/docs/Financial-Aid-AgentCore-Maintenance.docx
@@ -57,7 +57,7 @@
           <w:sz w:val="19"/>
           <w:szCs w:val="19"/>
         </w:rPr>
-        <w:t xml:space="preserve">Day-two operations for the governed Financial Aid Verification &amp; Student Communication Assistant. THE SUPPORTED DEPLOYMENT IS AWS CDK at the validated release tag v0.1.0-pilot-rc1 (EP1 live-validated). This guide's operational content applies to that deployment; the shell-engine commands in sections 2 and 6 are LEGACY internal reference only. Accelerator reference. Version 2.0 · 2026-07.</w:t>
+        <w:t xml:space="preserve">Day-two operations for the governed Financial Aid Verification &amp; Student Communication Assistant. THE SUPPORTED DEPLOYMENT IS AWS CDK at the validated release tag v0.1.1-pilot-rc1 (EP1 live-validated). This guide's operational content applies to that deployment; the shell-engine commands in sections 2 and 6 are LEGACY internal reference only. Accelerator reference. Version 2.0 · 2026-07.</w:t>
       </w:r>
     </w:p>
     <w:p>
@@ -269,7 +269,7 @@
               <w:spacing w:after="20" w:line="258"/>
             </w:pPr>
             <w:r>
-              <w:t xml:space="preserve">Deploy, upgrade, and tear down via AWS CDK at the validated release tag (`git checkout v0.1.0-pilot-rc1` then `cdk deploy`/`destroy --all`). The shell-engine (deploy.sh/demo.sh/destroy.sh) commands below are LEGACY internal reference. Upgrades: deploy a new tagged release (change-sets are reviewable), never patch in place; roll back by redeploying the prior tag. See DEPLOYMENT-GUIDE.md and docs/KEY-MANAGEMENT.md.</w:t>
+              <w:t xml:space="preserve">Deploy, upgrade, and tear down via AWS CDK at the validated release tag (`git checkout v0.1.1-pilot-rc1` then `cdk deploy`/`destroy --all`). The shell-engine (deploy.sh/demo.sh/destroy.sh) commands below are LEGACY internal reference. Upgrades: deploy a new tagged release (change-sets are reviewable), never patch in place; roll back by redeploying the prior tag. See DEPLOYMENT-GUIDE.md and docs/KEY-MANAGEMENT.md.</w:t>
             </w:r>
           </w:p>
         </w:tc>

</xml_diff>